<commit_message>
Refactor charts generation and reporting
- Updated charts.py to implement a split-axis design for throughput and checks charts, improving visual clarity.
- Removed package.json and package-lock.json as they are no longer needed.
- Added k6_append.py script to append test case information to results.
- Modified run-all-k6.sh to utilize k6_append.py for processing summary files.
- Updated binary files: chart images and report document to reflect new changes.
- Adjusted results.txt to include additional metrics and test case identifiers.
</commit_message>
<xml_diff>
--- a/charts/reporte_rendimiento.docx
+++ b/charts/reporte_rendimiento.docx
@@ -2714,7 +2714,7 @@
           <w:sz w:val="17"/>
           <w:szCs w:val="17"/>
         </w:rPr>
-        <w:t xml:space="preserve">Tabla 1. Resumen de resultados de pruebas de rendimiento — k6</w:t>
+        <w:t xml:space="preserve">Tabla 1. Resumen de resultados de pruebas de rendimiento (k6)</w:t>
       </w:r>
     </w:p>
     <w:p>
@@ -2769,7 +2769,7 @@
           <w:sz w:val="20"/>
           <w:szCs w:val="20"/>
         </w:rPr>
-        <w:t xml:space="preserve">El límite de tiempo de respuesta propuesto para este sistema es de 400 ms. La mayoría de los escenarios se mantuvieron por debajo de ese límite. El escenario TC14 (registro masivo) superó el límite propuesto con un P95 de 842 ms, lo que refleja el costo inherente del cifrado bcrypt bajo 30 usuarios concurrentes sin pausa entre peticiones — un hallazgo esperado y documentado. TC59 (flujo login+perfil, 50 VUs durante 3 minutos) alcanzó un P95 de 1,040 ms, indicando saturación del endpoint de autenticación bajo carga sostenida. Los escenarios funcionales (TC29, TC30) respondieron en menos de 60 ms. Notablemente, TC60 (estrés con 200 VUs) mantuvo un P95 de solo 63 ms gracias a la simplicidad del endpoint de creación de órdenes.</w:t>
+        <w:t xml:space="preserve">El límite de tiempo de respuesta propuesto para este sistema es de 400 ms. La mayoría de los escenarios se mantuvieron por debajo de ese límite. El escenario TC14 (registro masivo) superó el límite propuesto con un P95 de 842 ms, lo que refleja el costo inherente del cifrado bcrypt bajo 30 usuarios concurrentes sin pausa entre peticiones, un hallazgo esperado y documentado. TC59 (flujo login+perfil, 50 VUs durante 3 minutos) alcanzó un P95 de 1,040 ms, indicando saturación del endpoint de autenticación bajo carga sostenida. Los escenarios funcionales (TC29, TC30) respondieron en menos de 60 ms. Notablemente, TC60 (estrés con 200 VUs) mantuvo un P95 de solo 63 ms gracias a la simplicidad del endpoint de creación de órdenes.</w:t>
       </w:r>
     </w:p>
     <w:p>
@@ -2840,7 +2840,7 @@
           <w:sz w:val="17"/>
           <w:szCs w:val="17"/>
         </w:rPr>
-        <w:t xml:space="preserve">Figura 1. Tiempos de respuesta por caso de prueba — la línea roja indica el límite propuesto de 400 ms</w:t>
+        <w:t xml:space="preserve">Figura 1. Tiempos de respuesta por caso de prueba. La línea roja indica el límite propuesto de 400 ms.</w:t>
       </w:r>
     </w:p>
     <w:p>
@@ -2880,7 +2880,7 @@
           <w:sz w:val="20"/>
           <w:szCs w:val="20"/>
         </w:rPr>
-        <w:t xml:space="preserve">Cuando un escenario genera una cantidad de peticiones muy superior al resto, los gráficos utilizan una barra truncada: la barra se dibuja hasta un límite visual y el valor real se indica con una etiqueta. Esto permite comparar todos los escenarios en la misma escala sin que un caso extremo haga ilegibles los demás.</w:t>
+        <w:t xml:space="preserve">Los gráficos de tasa de procesamiento y de verificaciones utilizan un eje partido, indicado por las marcas diagonales visibles en el gráfico. Esta técnica se aplica cuando existe una diferencia de escala muy grande entre escenarios: si el eje fuera continuo, los casos de menor volumen quedarían comprimidos e ilegibles. El corte permite mostrar cada rango en su propia escala y comparar con claridad todos los escenarios.</w:t>
       </w:r>
     </w:p>
     <w:p>
@@ -2966,7 +2966,7 @@
           <w:sz w:val="17"/>
           <w:szCs w:val="17"/>
         </w:rPr>
-        <w:t xml:space="preserve">Figura 2. Tasa de procesamiento en peticiones por segundo — barra de TC60 truncada (valor real: 3,843 pet/s)</w:t>
+        <w:t xml:space="preserve">Figura 2. Tasa de procesamiento en peticiones por segundo. Eje partido para visualizar la comparación de mejor manera.</w:t>
       </w:r>
     </w:p>
     <w:p>
@@ -3077,7 +3077,7 @@
           <w:sz w:val="17"/>
           <w:szCs w:val="17"/>
         </w:rPr>
-        <w:t xml:space="preserve">Figura 3. Total de verificaciones ejecutadas por caso de prueba — barra de TC60 truncada (valor real: 461,442). Todas con 100% de éxito.</w:t>
+        <w:t xml:space="preserve">Figura 3. Total de verificaciones ejecutadas por caso de prueba. Eje partido para visualizar la comparación de mejor manera. Todas con 100% de éxito.</w:t>
       </w:r>
     </w:p>
     <w:p>

</xml_diff>